<commit_message>
feat: add contract templates for house, apartment, and room rentals
</commit_message>
<xml_diff>
--- a/hs-contract-service/contract-template/HomeSpace_01_Hop_Dong_Thue_Nha_Nguyen_Can.docx
+++ b/hs-contract-service/contract-template/HomeSpace_01_Hop_Dong_Thue_Nha_Nguyen_Can.docx
@@ -4,6 +4,9 @@
   <w:body>
     <w:p>
       <w:pPr>
+        <w:keepNext w:val="0"/>
+        <w:spacing w:before="0" w:after="0" w:line="269" w:lineRule="auto"/>
+        <w:ind w:left="0"/>
         <w:jc w:val="center"/>
       </w:pPr>
       <w:r>
@@ -18,7 +21,9 @@
     </w:p>
     <w:p>
       <w:pPr>
-        <w:spacing w:after="140"/>
+        <w:keepNext w:val="0"/>
+        <w:spacing w:before="0" w:after="140" w:line="269" w:lineRule="auto"/>
+        <w:ind w:left="0"/>
         <w:jc w:val="center"/>
       </w:pPr>
       <w:r>
@@ -33,7 +38,9 @@
     </w:p>
     <w:p>
       <w:pPr>
-        <w:spacing w:after="40"/>
+        <w:keepNext w:val="0"/>
+        <w:spacing w:before="0" w:after="40" w:line="269" w:lineRule="auto"/>
+        <w:ind w:left="0"/>
         <w:jc w:val="center"/>
       </w:pPr>
       <w:r>
@@ -49,7 +56,8 @@
     <w:p>
       <w:pPr>
         <w:keepNext w:val="0"/>
-        <w:spacing w:before="0" w:after="100" w:line="276" w:lineRule="auto"/>
+        <w:spacing w:before="0" w:after="100" w:line="269" w:lineRule="auto"/>
+        <w:ind w:left="0"/>
         <w:jc w:val="center"/>
       </w:pPr>
       <w:r>
@@ -110,7 +118,9 @@
     <w:p>
       <w:pPr>
         <w:keepNext/>
-        <w:spacing w:before="100" w:after="60"/>
+        <w:spacing w:before="100" w:after="60" w:line="269" w:lineRule="auto"/>
+        <w:ind w:left="0"/>
+        <w:jc w:val="left"/>
       </w:pPr>
       <w:r>
         <w:rPr>
@@ -124,8 +134,10 @@
     </w:p>
     <w:p>
       <w:pPr>
-        <w:spacing w:after="30" w:line="264" w:lineRule="auto"/>
+        <w:keepNext w:val="0"/>
+        <w:spacing w:before="0" w:after="30" w:line="269" w:lineRule="auto"/>
         <w:ind w:left="312" w:hanging="170"/>
+        <w:jc w:val="both"/>
       </w:pPr>
       <w:r>
         <w:rPr>
@@ -139,8 +151,10 @@
     </w:p>
     <w:p>
       <w:pPr>
-        <w:spacing w:after="30" w:line="264" w:lineRule="auto"/>
+        <w:keepNext w:val="0"/>
+        <w:spacing w:before="0" w:after="30" w:line="269" w:lineRule="auto"/>
         <w:ind w:left="312" w:hanging="170"/>
+        <w:jc w:val="both"/>
       </w:pPr>
       <w:r>
         <w:rPr>
@@ -154,8 +168,10 @@
     </w:p>
     <w:p>
       <w:pPr>
-        <w:spacing w:after="30" w:line="264" w:lineRule="auto"/>
+        <w:keepNext w:val="0"/>
+        <w:spacing w:before="0" w:after="30" w:line="269" w:lineRule="auto"/>
         <w:ind w:left="312" w:hanging="170"/>
+        <w:jc w:val="both"/>
       </w:pPr>
       <w:r>
         <w:rPr>
@@ -169,8 +185,10 @@
     </w:p>
     <w:p>
       <w:pPr>
-        <w:spacing w:after="30" w:line="264" w:lineRule="auto"/>
+        <w:keepNext w:val="0"/>
+        <w:spacing w:before="0" w:after="30" w:line="269" w:lineRule="auto"/>
         <w:ind w:left="312" w:hanging="170"/>
+        <w:jc w:val="both"/>
       </w:pPr>
       <w:r>
         <w:rPr>
@@ -184,8 +202,10 @@
     </w:p>
     <w:p>
       <w:pPr>
-        <w:spacing w:after="30" w:line="264" w:lineRule="auto"/>
+        <w:keepNext w:val="0"/>
+        <w:spacing w:before="0" w:after="30" w:line="269" w:lineRule="auto"/>
         <w:ind w:left="312" w:hanging="170"/>
+        <w:jc w:val="both"/>
       </w:pPr>
       <w:r>
         <w:rPr>
@@ -199,8 +219,10 @@
     </w:p>
     <w:p>
       <w:pPr>
-        <w:spacing w:after="30" w:line="264" w:lineRule="auto"/>
+        <w:keepNext w:val="0"/>
+        <w:spacing w:before="0" w:after="30" w:line="269" w:lineRule="auto"/>
         <w:ind w:left="312" w:hanging="170"/>
+        <w:jc w:val="both"/>
       </w:pPr>
       <w:r>
         <w:rPr>
@@ -215,7 +237,9 @@
     <w:p>
       <w:pPr>
         <w:keepNext/>
-        <w:spacing w:before="100" w:after="60"/>
+        <w:spacing w:before="100" w:after="60" w:line="269" w:lineRule="auto"/>
+        <w:ind w:left="0"/>
+        <w:jc w:val="left"/>
       </w:pPr>
       <w:r>
         <w:rPr>
@@ -230,7 +254,9 @@
     <w:p>
       <w:pPr>
         <w:keepNext w:val="0"/>
-        <w:spacing w:before="0" w:after="40" w:line="276" w:lineRule="auto"/>
+        <w:spacing w:before="0" w:after="40" w:line="269" w:lineRule="auto"/>
+        <w:ind w:left="0"/>
+        <w:jc w:val="both"/>
       </w:pPr>
       <w:r>
         <w:rPr>
@@ -254,7 +280,9 @@
     <w:p>
       <w:pPr>
         <w:keepNext w:val="0"/>
-        <w:spacing w:before="0" w:after="40" w:line="276" w:lineRule="auto"/>
+        <w:spacing w:before="0" w:after="40" w:line="269" w:lineRule="auto"/>
+        <w:ind w:left="0"/>
+        <w:jc w:val="both"/>
       </w:pPr>
       <w:r>
         <w:rPr>
@@ -296,7 +324,9 @@
     <w:p>
       <w:pPr>
         <w:keepNext w:val="0"/>
-        <w:spacing w:before="0" w:after="40" w:line="276" w:lineRule="auto"/>
+        <w:spacing w:before="0" w:after="40" w:line="269" w:lineRule="auto"/>
+        <w:ind w:left="0"/>
+        <w:jc w:val="both"/>
       </w:pPr>
       <w:r>
         <w:rPr>
@@ -338,7 +368,71 @@
     <w:p>
       <w:pPr>
         <w:keepNext w:val="0"/>
-        <w:spacing w:before="0" w:after="40" w:line="276" w:lineRule="auto"/>
+        <w:spacing w:before="0" w:after="40" w:line="269" w:lineRule="auto"/>
+        <w:ind w:left="0"/>
+        <w:jc w:val="both"/>
+      </w:pPr>
+      <w:r>
+        <w:rPr>
+          <w:rFonts w:ascii="Times New Roman" w:hAnsi="Times New Roman" w:eastAsia="Times New Roman"/>
+          <w:b w:val="0"/>
+          <w:i w:val="0"/>
+          <w:sz w:val="26"/>
+        </w:rPr>
+        <w:t xml:space="preserve">Tài khoản nhận thanh toán - Chủ tài khoản: </w:t>
+      </w:r>
+      <w:r>
+        <w:rPr>
+          <w:rFonts w:ascii="Times New Roman" w:hAnsi="Times New Roman" w:eastAsia="Times New Roman"/>
+          <w:b w:val="0"/>
+          <w:i w:val="0"/>
+          <w:sz w:val="26"/>
+        </w:rPr>
+        <w:t>{{landlord.bankAccountHolder}}</w:t>
+      </w:r>
+      <w:r>
+        <w:rPr>
+          <w:rFonts w:ascii="Times New Roman" w:hAnsi="Times New Roman" w:eastAsia="Times New Roman"/>
+          <w:b w:val="0"/>
+          <w:i w:val="0"/>
+          <w:sz w:val="26"/>
+        </w:rPr>
+        <w:t xml:space="preserve">; Số tài khoản: </w:t>
+      </w:r>
+      <w:r>
+        <w:rPr>
+          <w:rFonts w:ascii="Times New Roman" w:hAnsi="Times New Roman" w:eastAsia="Times New Roman"/>
+          <w:b w:val="0"/>
+          <w:i w:val="0"/>
+          <w:sz w:val="26"/>
+        </w:rPr>
+        <w:t>{{landlord.bankAccountNumber}}</w:t>
+      </w:r>
+      <w:r>
+        <w:rPr>
+          <w:rFonts w:ascii="Times New Roman" w:hAnsi="Times New Roman" w:eastAsia="Times New Roman"/>
+          <w:b w:val="0"/>
+          <w:i w:val="0"/>
+          <w:sz w:val="26"/>
+        </w:rPr>
+        <w:t xml:space="preserve">; Ngân hàng: </w:t>
+      </w:r>
+      <w:r>
+        <w:rPr>
+          <w:rFonts w:ascii="Times New Roman" w:hAnsi="Times New Roman" w:eastAsia="Times New Roman"/>
+          <w:b w:val="0"/>
+          <w:i w:val="0"/>
+          <w:sz w:val="26"/>
+        </w:rPr>
+        <w:t>{{landlord.bankName}}</w:t>
+      </w:r>
+    </w:p>
+    <w:p>
+      <w:pPr>
+        <w:keepNext w:val="0"/>
+        <w:spacing w:before="0" w:after="40" w:line="269" w:lineRule="auto"/>
+        <w:ind w:left="0"/>
+        <w:jc w:val="both"/>
       </w:pPr>
       <w:r>
         <w:rPr>
@@ -362,7 +456,9 @@
     <w:p>
       <w:pPr>
         <w:keepNext w:val="0"/>
-        <w:spacing w:before="0" w:after="40" w:line="276" w:lineRule="auto"/>
+        <w:spacing w:before="0" w:after="40" w:line="269" w:lineRule="auto"/>
+        <w:ind w:left="0"/>
+        <w:jc w:val="both"/>
       </w:pPr>
       <w:r>
         <w:rPr>
@@ -404,7 +500,9 @@
     <w:p>
       <w:pPr>
         <w:keepNext w:val="0"/>
-        <w:spacing w:before="0" w:after="40" w:line="276" w:lineRule="auto"/>
+        <w:spacing w:before="0" w:after="40" w:line="269" w:lineRule="auto"/>
+        <w:ind w:left="0"/>
+        <w:jc w:val="both"/>
       </w:pPr>
       <w:r>
         <w:rPr>
@@ -446,7 +544,9 @@
     <w:p>
       <w:pPr>
         <w:keepNext w:val="0"/>
-        <w:spacing w:before="0" w:after="40" w:line="276" w:lineRule="auto"/>
+        <w:spacing w:before="0" w:after="40" w:line="269" w:lineRule="auto"/>
+        <w:ind w:left="0"/>
+        <w:jc w:val="both"/>
       </w:pPr>
       <w:r>
         <w:rPr>
@@ -455,7 +555,7 @@
           <w:i w:val="0"/>
           <w:sz w:val="26"/>
         </w:rPr>
-        <w:t xml:space="preserve">Số người cư trú đăng ký: </w:t>
+        <w:t xml:space="preserve">Số người cư trú: </w:t>
       </w:r>
       <w:r>
         <w:rPr>
@@ -505,8 +605,72 @@
     </w:p>
     <w:p>
       <w:pPr>
+        <w:keepNext w:val="0"/>
+        <w:spacing w:before="0" w:after="40" w:line="269" w:lineRule="auto"/>
+        <w:ind w:left="0"/>
+        <w:jc w:val="both"/>
+      </w:pPr>
+      <w:r>
+        <w:rPr>
+          <w:rFonts w:ascii="Times New Roman" w:hAnsi="Times New Roman" w:eastAsia="Times New Roman"/>
+          <w:b w:val="0"/>
+          <w:i w:val="0"/>
+          <w:sz w:val="26"/>
+        </w:rPr>
+        <w:t xml:space="preserve">Tài khoản nhận hoàn trả - Chủ tài khoản: </w:t>
+      </w:r>
+      <w:r>
+        <w:rPr>
+          <w:rFonts w:ascii="Times New Roman" w:hAnsi="Times New Roman" w:eastAsia="Times New Roman"/>
+          <w:b w:val="0"/>
+          <w:i w:val="0"/>
+          <w:sz w:val="26"/>
+        </w:rPr>
+        <w:t>{{tenant.bankAccountHolder}}</w:t>
+      </w:r>
+      <w:r>
+        <w:rPr>
+          <w:rFonts w:ascii="Times New Roman" w:hAnsi="Times New Roman" w:eastAsia="Times New Roman"/>
+          <w:b w:val="0"/>
+          <w:i w:val="0"/>
+          <w:sz w:val="26"/>
+        </w:rPr>
+        <w:t xml:space="preserve">; Số tài khoản: </w:t>
+      </w:r>
+      <w:r>
+        <w:rPr>
+          <w:rFonts w:ascii="Times New Roman" w:hAnsi="Times New Roman" w:eastAsia="Times New Roman"/>
+          <w:b w:val="0"/>
+          <w:i w:val="0"/>
+          <w:sz w:val="26"/>
+        </w:rPr>
+        <w:t>{{tenant.bankAccountNumber}}</w:t>
+      </w:r>
+      <w:r>
+        <w:rPr>
+          <w:rFonts w:ascii="Times New Roman" w:hAnsi="Times New Roman" w:eastAsia="Times New Roman"/>
+          <w:b w:val="0"/>
+          <w:i w:val="0"/>
+          <w:sz w:val="26"/>
+        </w:rPr>
+        <w:t xml:space="preserve">; Ngân hàng: </w:t>
+      </w:r>
+      <w:r>
+        <w:rPr>
+          <w:rFonts w:ascii="Times New Roman" w:hAnsi="Times New Roman" w:eastAsia="Times New Roman"/>
+          <w:b w:val="0"/>
+          <w:i w:val="0"/>
+          <w:sz w:val="26"/>
+        </w:rPr>
+        <w:t>{{tenant.bankName}}</w:t>
+      </w:r>
+    </w:p>
+    <w:p>
+      <w:pPr>
         <w:keepNext/>
-        <w:spacing w:before="100" w:after="60"/>
+        <w:spacing w:before="100" w:after="60" w:line="269" w:lineRule="auto"/>
+        <w:ind w:left="0"/>
+        <w:jc w:val="left"/>
       </w:pPr>
       <w:r>
         <w:rPr>
@@ -521,7 +685,9 @@
     <w:p>
       <w:pPr>
         <w:keepNext w:val="0"/>
-        <w:spacing w:before="0" w:after="40" w:line="276" w:lineRule="auto"/>
+        <w:spacing w:before="0" w:after="40" w:line="269" w:lineRule="auto"/>
+        <w:ind w:left="0"/>
+        <w:jc w:val="both"/>
       </w:pPr>
       <w:r>
         <w:rPr>
@@ -554,7 +720,9 @@
     <w:p>
       <w:pPr>
         <w:keepNext w:val="0"/>
-        <w:spacing w:before="0" w:after="40" w:line="276" w:lineRule="auto"/>
+        <w:spacing w:before="0" w:after="40" w:line="269" w:lineRule="auto"/>
+        <w:ind w:left="0"/>
+        <w:jc w:val="both"/>
       </w:pPr>
       <w:r>
         <w:rPr>
@@ -573,6 +741,24 @@
           <w:sz w:val="26"/>
         </w:rPr>
         <w:t>{{property.areaText}}</w:t>
+      </w:r>
+      <w:r>
+        <w:rPr>
+          <w:rFonts w:ascii="Times New Roman" w:hAnsi="Times New Roman" w:eastAsia="Times New Roman"/>
+          <w:b w:val="0"/>
+          <w:i w:val="0"/>
+          <w:sz w:val="26"/>
+        </w:rPr>
+        <w:t xml:space="preserve">; Loại tài sản: </w:t>
+      </w:r>
+      <w:r>
+        <w:rPr>
+          <w:rFonts w:ascii="Times New Roman" w:hAnsi="Times New Roman" w:eastAsia="Times New Roman"/>
+          <w:b w:val="0"/>
+          <w:i w:val="0"/>
+          <w:sz w:val="26"/>
+        </w:rPr>
+        <w:t>{{property.propertyType}}</w:t>
       </w:r>
       <w:r>
         <w:rPr>
@@ -635,31 +821,15 @@
           <w:i w:val="0"/>
           <w:sz w:val="26"/>
         </w:rPr>
-        <w:t xml:space="preserve">; Loại tài sản: </w:t>
-      </w:r>
-      <w:r>
-        <w:rPr>
-          <w:rFonts w:ascii="Times New Roman" w:hAnsi="Times New Roman" w:eastAsia="Times New Roman"/>
-          <w:b w:val="0"/>
-          <w:i w:val="0"/>
-          <w:sz w:val="26"/>
-        </w:rPr>
-        <w:t>{{property.propertyType}}</w:t>
-      </w:r>
-      <w:r>
-        <w:rPr>
-          <w:rFonts w:ascii="Times New Roman" w:hAnsi="Times New Roman" w:eastAsia="Times New Roman"/>
-          <w:b w:val="0"/>
-          <w:i w:val="0"/>
-          <w:sz w:val="26"/>
-        </w:rPr>
         <w:t>.</w:t>
       </w:r>
     </w:p>
     <w:p>
       <w:pPr>
         <w:keepNext w:val="0"/>
-        <w:spacing w:before="0" w:after="40" w:line="276" w:lineRule="auto"/>
+        <w:spacing w:before="0" w:after="40" w:line="269" w:lineRule="auto"/>
+        <w:ind w:left="0"/>
+        <w:jc w:val="both"/>
       </w:pPr>
       <w:r>
         <w:rPr>
@@ -668,7 +838,7 @@
           <w:i w:val="0"/>
           <w:sz w:val="26"/>
         </w:rPr>
-        <w:t xml:space="preserve">1.3. Số người tối đa theo nội quy/tình trạng tài sản: </w:t>
+        <w:t xml:space="preserve">1.3. Số người tối đa cho phép theo nội quy: </w:t>
       </w:r>
       <w:r>
         <w:rPr>
@@ -686,7 +856,7 @@
           <w:i w:val="0"/>
           <w:sz w:val="26"/>
         </w:rPr>
-        <w:t xml:space="preserve">; Số xe tối đa: </w:t>
+        <w:t xml:space="preserve">; Số xe tối đa cho phép: </w:t>
       </w:r>
       <w:r>
         <w:rPr>
@@ -709,7 +879,10 @@
     </w:p>
     <w:p>
       <w:pPr>
-        <w:spacing w:after="20"/>
+        <w:keepNext/>
+        <w:spacing w:before="0" w:after="20" w:line="269" w:lineRule="auto"/>
+        <w:ind w:left="0"/>
+        <w:jc w:val="both"/>
       </w:pPr>
       <w:r>
         <w:rPr>
@@ -723,7 +896,9 @@
     </w:p>
     <w:p>
       <w:pPr>
-        <w:spacing w:after="60"/>
+        <w:keepNext w:val="0"/>
+        <w:spacing w:before="0" w:after="60" w:line="269" w:lineRule="auto"/>
+        <w:ind w:left="0"/>
         <w:jc w:val="center"/>
       </w:pPr>
       <w:r>
@@ -738,7 +913,8 @@
     </w:p>
     <w:p>
       <w:pPr>
-        <w:spacing w:after="40" w:line="276" w:lineRule="auto"/>
+        <w:keepNext w:val="0"/>
+        <w:spacing w:before="0" w:after="40" w:line="269" w:lineRule="auto"/>
         <w:ind w:left="0"/>
         <w:jc w:val="both"/>
       </w:pPr>
@@ -755,7 +931,9 @@
     <w:p>
       <w:pPr>
         <w:keepNext/>
-        <w:spacing w:before="100" w:after="60"/>
+        <w:spacing w:before="100" w:after="60" w:line="269" w:lineRule="auto"/>
+        <w:ind w:left="0"/>
+        <w:jc w:val="left"/>
       </w:pPr>
       <w:r>
         <w:rPr>
@@ -770,7 +948,9 @@
     <w:p>
       <w:pPr>
         <w:keepNext w:val="0"/>
-        <w:spacing w:before="0" w:after="40" w:line="276" w:lineRule="auto"/>
+        <w:spacing w:before="0" w:after="40" w:line="269" w:lineRule="auto"/>
+        <w:ind w:left="0"/>
+        <w:jc w:val="both"/>
       </w:pPr>
       <w:r>
         <w:rPr>
@@ -857,7 +1037,9 @@
     <w:p>
       <w:pPr>
         <w:keepNext w:val="0"/>
-        <w:spacing w:before="0" w:after="40" w:line="276" w:lineRule="auto"/>
+        <w:spacing w:before="0" w:after="40" w:line="269" w:lineRule="auto"/>
+        <w:ind w:left="0"/>
+        <w:jc w:val="both"/>
       </w:pPr>
       <w:r>
         <w:rPr>
@@ -890,7 +1072,9 @@
     <w:p>
       <w:pPr>
         <w:keepNext w:val="0"/>
-        <w:spacing w:before="0" w:after="40" w:line="276" w:lineRule="auto"/>
+        <w:spacing w:before="0" w:after="40" w:line="269" w:lineRule="auto"/>
+        <w:ind w:left="0"/>
+        <w:jc w:val="both"/>
       </w:pPr>
       <w:r>
         <w:rPr>
@@ -899,7 +1083,7 @@
           <w:i w:val="0"/>
           <w:sz w:val="26"/>
         </w:rPr>
-        <w:t xml:space="preserve">2.3. Chỉ số công tơ điện ban đầu: </w:t>
+        <w:t xml:space="preserve">2.3. Bàn giao chỉ số công tơ điện ban đầu: </w:t>
       </w:r>
       <w:r>
         <w:rPr>
@@ -941,7 +1125,9 @@
     <w:p>
       <w:pPr>
         <w:keepNext/>
-        <w:spacing w:before="100" w:after="60"/>
+        <w:spacing w:before="100" w:after="60" w:line="269" w:lineRule="auto"/>
+        <w:ind w:left="0"/>
+        <w:jc w:val="left"/>
       </w:pPr>
       <w:r>
         <w:rPr>
@@ -950,13 +1136,15 @@
           <w:i w:val="0"/>
           <w:sz w:val="26"/>
         </w:rPr>
-        <w:t>ĐIỀU 3. GIÁ THUÊ, TIỀN CỌC VÀ PHƯƠNG THỨC THANH TOÁN</w:t>
+        <w:t>ĐIỀU 3. GIÁ THUÊ, TIỀN CỌC VÀ PHƯƠNG THỨC CHUYỂN KHOẢN TRỰC TIẾP</w:t>
       </w:r>
     </w:p>
     <w:p>
       <w:pPr>
         <w:keepNext w:val="0"/>
-        <w:spacing w:before="0" w:after="40" w:line="276" w:lineRule="auto"/>
+        <w:spacing w:before="0" w:after="40" w:line="269" w:lineRule="auto"/>
+        <w:ind w:left="0"/>
+        <w:jc w:val="both"/>
       </w:pPr>
       <w:r>
         <w:rPr>
@@ -1007,7 +1195,9 @@
     <w:p>
       <w:pPr>
         <w:keepNext w:val="0"/>
-        <w:spacing w:before="0" w:after="40" w:line="276" w:lineRule="auto"/>
+        <w:spacing w:before="0" w:after="40" w:line="269" w:lineRule="auto"/>
+        <w:ind w:left="0"/>
+        <w:jc w:val="both"/>
       </w:pPr>
       <w:r>
         <w:rPr>
@@ -1058,7 +1248,9 @@
     <w:p>
       <w:pPr>
         <w:keepNext w:val="0"/>
-        <w:spacing w:before="0" w:after="40" w:line="276" w:lineRule="auto"/>
+        <w:spacing w:before="0" w:after="40" w:line="269" w:lineRule="auto"/>
+        <w:ind w:left="0"/>
+        <w:jc w:val="both"/>
       </w:pPr>
       <w:r>
         <w:rPr>
@@ -1085,13 +1277,15 @@
           <w:i w:val="0"/>
           <w:sz w:val="26"/>
         </w:rPr>
-        <w:t xml:space="preserve"> qua nền tảng HomeSpace. Tiền thuê và tiền cọc không thanh toán trực tiếp vào tài khoản cá nhân của Bên A.</w:t>
+        <w:t>.</w:t>
       </w:r>
     </w:p>
     <w:p>
       <w:pPr>
         <w:keepNext w:val="0"/>
-        <w:spacing w:before="0" w:after="40" w:line="276" w:lineRule="auto"/>
+        <w:spacing w:before="0" w:after="40" w:line="269" w:lineRule="auto"/>
+        <w:ind w:left="0"/>
+        <w:jc w:val="both"/>
       </w:pPr>
       <w:r>
         <w:rPr>
@@ -1142,7 +1336,9 @@
     <w:p>
       <w:pPr>
         <w:keepNext w:val="0"/>
-        <w:spacing w:before="0" w:after="40" w:line="276" w:lineRule="auto"/>
+        <w:spacing w:before="0" w:after="40" w:line="269" w:lineRule="auto"/>
+        <w:ind w:left="0"/>
+        <w:jc w:val="both"/>
       </w:pPr>
       <w:r>
         <w:rPr>
@@ -1151,7 +1347,7 @@
           <w:i w:val="0"/>
           <w:sz w:val="26"/>
         </w:rPr>
-        <w:t xml:space="preserve">3.5. Điều kiện hoàn trả/khấu trừ tiền cọc: </w:t>
+        <w:t xml:space="preserve">3.5. Điều kiện hoàn trả/khấu trừ cọc: </w:t>
       </w:r>
       <w:r>
         <w:rPr>
@@ -1174,7 +1370,26 @@
     </w:p>
     <w:p>
       <w:pPr>
-        <w:spacing w:after="40" w:line="276" w:lineRule="auto"/>
+        <w:keepNext/>
+        <w:spacing w:before="0" w:after="40" w:line="269" w:lineRule="auto"/>
+        <w:ind w:left="0"/>
+        <w:jc w:val="left"/>
+      </w:pPr>
+      <w:r>
+        <w:rPr>
+          <w:rFonts w:ascii="Times New Roman" w:hAnsi="Times New Roman" w:eastAsia="Times New Roman"/>
+          <w:b w:val="0"/>
+          <w:i w:val="0"/>
+          <w:sz w:val="26"/>
+        </w:rPr>
+        <w:t>3.6. Quy định chi tiết về chuyển khoản trực tiếp và vai trò HomeSpace:</w:t>
+      </w:r>
+    </w:p>
+    <w:p>
+      <w:pPr>
+        <w:keepNext w:val="0"/>
+        <w:spacing w:before="0" w:after="40" w:line="269" w:lineRule="auto"/>
+        <w:ind w:left="198"/>
         <w:jc w:val="both"/>
       </w:pPr>
       <w:r>
@@ -1184,12 +1399,134 @@
           <w:i w:val="0"/>
           <w:sz w:val="26"/>
         </w:rPr>
-        <w:t>3.6. Trước thời điểm ký hợp đồng, Bên B đã hoàn tất thanh toán khoản tiền ban đầu qua hệ thống HomeSpace theo thông tin tại Phụ lục thanh toán đính kèm.</w:t>
+        <w:t>3.6.1. Bên B thanh toán tiền thuê, tiền đặt cọc và các khoản phải trả khác bằng hình thức chuyển khoản trực tiếp vào tài khoản do Bên A chỉ định trong Hợp đồng này hoặc tài khoản thay thế được hai bên xác nhận bằng văn bản hoặc thông điệp dữ liệu.</w:t>
       </w:r>
     </w:p>
     <w:p>
       <w:pPr>
-        <w:spacing w:after="20"/>
+        <w:keepNext w:val="0"/>
+        <w:spacing w:before="0" w:after="40" w:line="269" w:lineRule="auto"/>
+        <w:ind w:left="198"/>
+        <w:jc w:val="both"/>
+      </w:pPr>
+      <w:r>
+        <w:rPr>
+          <w:rFonts w:ascii="Times New Roman" w:hAnsi="Times New Roman" w:eastAsia="Times New Roman"/>
+          <w:b w:val="0"/>
+          <w:i w:val="0"/>
+          <w:sz w:val="26"/>
+        </w:rPr>
+        <w:t>3.6.2. HomeSpace cung cấp công cụ tính toán khoản phải trả, tạo thông tin VietQR, lưu trữ yêu cầu thanh toán và ghi nhận trạng thái do các bên khai báo. HomeSpace không nhận tiền, không giữ tiền, không chuyển tiền thay các bên và không thay thế ngân hàng xác nhận việc ghi Có hoặc ghi Nợ trên tài khoản.</w:t>
+      </w:r>
+    </w:p>
+    <w:p>
+      <w:pPr>
+        <w:keepNext w:val="0"/>
+        <w:spacing w:before="0" w:after="40" w:line="269" w:lineRule="auto"/>
+        <w:ind w:left="198"/>
+        <w:jc w:val="both"/>
+      </w:pPr>
+      <w:r>
+        <w:rPr>
+          <w:rFonts w:ascii="Times New Roman" w:hAnsi="Times New Roman" w:eastAsia="Times New Roman"/>
+          <w:b w:val="0"/>
+          <w:i w:val="0"/>
+          <w:sz w:val="26"/>
+        </w:rPr>
+        <w:t>3.6.3. Một khoản thanh toán được ghi nhận hoàn tất trên HomeSpace sau khi Bên B khai báo đã thực hiện chuyển khoản và Bên A xác nhận đã nhận đủ số tiền tương ứng. Việc ghi nhận này được lập trên cơ sở xác nhận của các bên và không phải là xác nhận giao dịch do ngân hàng phát hành.</w:t>
+      </w:r>
+    </w:p>
+    <w:p>
+      <w:pPr>
+        <w:keepNext w:val="0"/>
+        <w:spacing w:before="0" w:after="40" w:line="269" w:lineRule="auto"/>
+        <w:ind w:left="198"/>
+        <w:jc w:val="both"/>
+      </w:pPr>
+      <w:r>
+        <w:rPr>
+          <w:rFonts w:ascii="Times New Roman" w:hAnsi="Times New Roman" w:eastAsia="Times New Roman"/>
+          <w:b w:val="0"/>
+          <w:i w:val="0"/>
+          <w:sz w:val="26"/>
+        </w:rPr>
+        <w:t>3.6.4. Bên B có trách nhiệm kiểm tra tên chủ tài khoản, số tài khoản, ngân hàng thụ hưởng, số tiền và nội dung chuyển khoản trước khi thực hiện. Bên A có trách nhiệm kiểm tra tài khoản nhận và xác nhận trung thực trạng thái nhận tiền.</w:t>
+      </w:r>
+    </w:p>
+    <w:p>
+      <w:pPr>
+        <w:keepNext w:val="0"/>
+        <w:spacing w:before="0" w:after="40" w:line="269" w:lineRule="auto"/>
+        <w:ind w:left="198"/>
+        <w:jc w:val="both"/>
+      </w:pPr>
+      <w:r>
+        <w:rPr>
+          <w:rFonts w:ascii="Times New Roman" w:hAnsi="Times New Roman" w:eastAsia="Times New Roman"/>
+          <w:b w:val="0"/>
+          <w:i w:val="0"/>
+          <w:sz w:val="26"/>
+        </w:rPr>
+        <w:t>3.6.5. Trường hợp thông tin khai báo giữa các bên không thống nhất, khoản thanh toán được chuyển sang trạng thái chờ đối soát. Các bên có trách nhiệm cung cấp chứng từ ngân hàng và phối hợp xác minh; HomeSpace chỉ lưu trữ thông tin, chứng từ và lịch sử xác nhận do các bên cung cấp.</w:t>
+      </w:r>
+    </w:p>
+    <w:p>
+      <w:pPr>
+        <w:keepNext w:val="0"/>
+        <w:spacing w:before="0" w:after="40" w:line="269" w:lineRule="auto"/>
+        <w:ind w:left="198"/>
+        <w:jc w:val="both"/>
+      </w:pPr>
+      <w:r>
+        <w:rPr>
+          <w:rFonts w:ascii="Times New Roman" w:hAnsi="Times New Roman" w:eastAsia="Times New Roman"/>
+          <w:b w:val="0"/>
+          <w:i w:val="0"/>
+          <w:sz w:val="26"/>
+        </w:rPr>
+        <w:t>3.6.6. Mọi thay đổi tài khoản nhận thanh toán hoặc tài khoản nhận hoàn trả chỉ có hiệu lực đối với nghĩa vụ phát sinh sau khi bên còn lại đã nhận được và xác nhận thông báo thay đổi. Việc thay đổi tài khoản trên hồ sơ HomeSpace không tự động sửa đổi phiên bản hợp đồng đang có hiệu lực.</w:t>
+      </w:r>
+    </w:p>
+    <w:p>
+      <w:pPr>
+        <w:keepNext w:val="0"/>
+        <w:spacing w:before="0" w:after="40" w:line="269" w:lineRule="auto"/>
+        <w:ind w:left="198"/>
+        <w:jc w:val="both"/>
+      </w:pPr>
+      <w:r>
+        <w:rPr>
+          <w:rFonts w:ascii="Times New Roman" w:hAnsi="Times New Roman" w:eastAsia="Times New Roman"/>
+          <w:b w:val="0"/>
+          <w:i w:val="0"/>
+          <w:sz w:val="26"/>
+        </w:rPr>
+        <w:t>3.6.7. Khi chấm dứt hoặc hết hạn hợp đồng, sau khi hai bên hoàn tất bàn giao và quyết toán, Bên A chuyển khoản số tiền cọc còn phải hoàn trực tiếp vào tài khoản nhận hoàn trả của Bên B ghi trong Hợp đồng hoặc tài khoản khác được hai bên xác nhận. Việc hoàn cọc được ghi nhận hoàn tất sau khi Bên A khai báo đã chuyển và Bên B xác nhận đã nhận đủ tiền.</w:t>
+      </w:r>
+    </w:p>
+    <w:p>
+      <w:pPr>
+        <w:keepNext/>
+        <w:spacing w:before="0" w:after="40" w:line="269" w:lineRule="auto"/>
+        <w:ind w:left="0"/>
+        <w:jc w:val="left"/>
+      </w:pPr>
+      <w:r>
+        <w:rPr>
+          <w:rFonts w:ascii="Times New Roman" w:hAnsi="Times New Roman" w:eastAsia="Times New Roman"/>
+          <w:b w:val="0"/>
+          <w:i w:val="0"/>
+          <w:sz w:val="26"/>
+        </w:rPr>
+        <w:t>3.7. Bảng ghi nhận thanh toán ban đầu đã được hai bên xác nhận:</w:t>
+      </w:r>
+    </w:p>
+    <w:p>
+      <w:pPr>
+        <w:keepNext/>
+        <w:spacing w:before="0" w:after="20" w:line="269" w:lineRule="auto"/>
+        <w:ind w:left="0"/>
+        <w:jc w:val="both"/>
       </w:pPr>
       <w:r>
         <w:rPr>
@@ -1198,12 +1535,14 @@
           <w:i w:val="0"/>
           <w:sz w:val="26"/>
         </w:rPr>
-        <w:t>Xác nhận thanh toán ban đầu:</w:t>
+        <w:t>Thông tin thanh toán ban đầu:</w:t>
       </w:r>
     </w:p>
     <w:p>
       <w:pPr>
-        <w:spacing w:after="60"/>
+        <w:keepNext w:val="0"/>
+        <w:spacing w:before="0" w:after="60" w:line="269" w:lineRule="auto"/>
+        <w:ind w:left="0"/>
         <w:jc w:val="center"/>
       </w:pPr>
       <w:r>
@@ -1219,7 +1558,9 @@
     <w:p>
       <w:pPr>
         <w:keepNext w:val="0"/>
-        <w:spacing w:before="0" w:after="40" w:line="276" w:lineRule="auto"/>
+        <w:spacing w:before="0" w:after="40" w:line="269" w:lineRule="auto"/>
+        <w:ind w:left="0"/>
+        <w:jc w:val="both"/>
       </w:pPr>
       <w:r>
         <w:rPr>
@@ -1228,7 +1569,151 @@
           <w:i w:val="0"/>
           <w:sz w:val="26"/>
         </w:rPr>
-        <w:t xml:space="preserve">Mã giao dịch: </w:t>
+        <w:t xml:space="preserve">Mã nội dung chuyển khoản: </w:t>
+      </w:r>
+      <w:r>
+        <w:rPr>
+          <w:rFonts w:ascii="Times New Roman" w:hAnsi="Times New Roman" w:eastAsia="Times New Roman"/>
+          <w:b w:val="0"/>
+          <w:i w:val="0"/>
+          <w:sz w:val="26"/>
+        </w:rPr>
+        <w:t>{{payment.initial.transferReference}}</w:t>
+      </w:r>
+      <w:r>
+        <w:rPr>
+          <w:rFonts w:ascii="Times New Roman" w:hAnsi="Times New Roman" w:eastAsia="Times New Roman"/>
+          <w:b w:val="0"/>
+          <w:i w:val="0"/>
+          <w:sz w:val="26"/>
+        </w:rPr>
+        <w:t xml:space="preserve">; Mã tham chiếu ngân hàng: </w:t>
+      </w:r>
+      <w:r>
+        <w:rPr>
+          <w:rFonts w:ascii="Times New Roman" w:hAnsi="Times New Roman" w:eastAsia="Times New Roman"/>
+          <w:b w:val="0"/>
+          <w:i w:val="0"/>
+          <w:sz w:val="26"/>
+        </w:rPr>
+        <w:t>{{payment.initial.bankTransactionReference}}</w:t>
+      </w:r>
+      <w:r>
+        <w:rPr>
+          <w:rFonts w:ascii="Times New Roman" w:hAnsi="Times New Roman" w:eastAsia="Times New Roman"/>
+          <w:b w:val="0"/>
+          <w:i w:val="0"/>
+          <w:sz w:val="26"/>
+        </w:rPr>
+        <w:t xml:space="preserve">; Bên B khai báo chuyển: </w:t>
+      </w:r>
+      <w:r>
+        <w:rPr>
+          <w:rFonts w:ascii="Times New Roman" w:hAnsi="Times New Roman" w:eastAsia="Times New Roman"/>
+          <w:b w:val="0"/>
+          <w:i w:val="0"/>
+          <w:sz w:val="26"/>
+        </w:rPr>
+        <w:t>{{payment.initial.payerReportedAt}}</w:t>
+      </w:r>
+      <w:r>
+        <w:rPr>
+          <w:rFonts w:ascii="Times New Roman" w:hAnsi="Times New Roman" w:eastAsia="Times New Roman"/>
+          <w:b w:val="0"/>
+          <w:i w:val="0"/>
+          <w:sz w:val="26"/>
+        </w:rPr>
+        <w:t xml:space="preserve">; Bên A xác nhận nhận: </w:t>
+      </w:r>
+      <w:r>
+        <w:rPr>
+          <w:rFonts w:ascii="Times New Roman" w:hAnsi="Times New Roman" w:eastAsia="Times New Roman"/>
+          <w:b w:val="0"/>
+          <w:i w:val="0"/>
+          <w:sz w:val="26"/>
+        </w:rPr>
+        <w:t>{{payment.initial.payeeConfirmedAt}}</w:t>
+      </w:r>
+      <w:r>
+        <w:rPr>
+          <w:rFonts w:ascii="Times New Roman" w:hAnsi="Times New Roman" w:eastAsia="Times New Roman"/>
+          <w:b w:val="0"/>
+          <w:i w:val="0"/>
+          <w:sz w:val="26"/>
+        </w:rPr>
+        <w:t xml:space="preserve">; Hoàn tất xác nhận hai chiều: </w:t>
+      </w:r>
+      <w:r>
+        <w:rPr>
+          <w:rFonts w:ascii="Times New Roman" w:hAnsi="Times New Roman" w:eastAsia="Times New Roman"/>
+          <w:b w:val="0"/>
+          <w:i w:val="0"/>
+          <w:sz w:val="26"/>
+        </w:rPr>
+        <w:t>{{payment.initial.confirmedAt}}</w:t>
+      </w:r>
+      <w:r>
+        <w:rPr>
+          <w:rFonts w:ascii="Times New Roman" w:hAnsi="Times New Roman" w:eastAsia="Times New Roman"/>
+          <w:b w:val="0"/>
+          <w:i w:val="0"/>
+          <w:sz w:val="26"/>
+        </w:rPr>
+        <w:t xml:space="preserve">; Trạng thái xác nhận: </w:t>
+      </w:r>
+      <w:r>
+        <w:rPr>
+          <w:rFonts w:ascii="Times New Roman" w:hAnsi="Times New Roman" w:eastAsia="Times New Roman"/>
+          <w:b w:val="0"/>
+          <w:i w:val="0"/>
+          <w:sz w:val="26"/>
+        </w:rPr>
+        <w:t>{{payment.initial.status}}</w:t>
+      </w:r>
+      <w:r>
+        <w:rPr>
+          <w:rFonts w:ascii="Times New Roman" w:hAnsi="Times New Roman" w:eastAsia="Times New Roman"/>
+          <w:b w:val="0"/>
+          <w:i w:val="0"/>
+          <w:sz w:val="26"/>
+        </w:rPr>
+        <w:t xml:space="preserve">; Tổng số tiền ban đầu: </w:t>
+      </w:r>
+      <w:r>
+        <w:rPr>
+          <w:rFonts w:ascii="Times New Roman" w:hAnsi="Times New Roman" w:eastAsia="Times New Roman"/>
+          <w:b w:val="0"/>
+          <w:i w:val="0"/>
+          <w:sz w:val="26"/>
+        </w:rPr>
+        <w:t>{{payment.initial.totalAmount}}</w:t>
+      </w:r>
+      <w:r>
+        <w:rPr>
+          <w:rFonts w:ascii="Times New Roman" w:hAnsi="Times New Roman" w:eastAsia="Times New Roman"/>
+          <w:b w:val="0"/>
+          <w:i w:val="0"/>
+          <w:sz w:val="26"/>
+        </w:rPr>
+        <w:t xml:space="preserve">; Thời điểm hoàn tất (tương thích V2): </w:t>
+      </w:r>
+      <w:r>
+        <w:rPr>
+          <w:rFonts w:ascii="Times New Roman" w:hAnsi="Times New Roman" w:eastAsia="Times New Roman"/>
+          <w:b w:val="0"/>
+          <w:i w:val="0"/>
+          <w:sz w:val="26"/>
+        </w:rPr>
+        <w:t>{{payment.initial.paidAt}}</w:t>
+      </w:r>
+      <w:r>
+        <w:rPr>
+          <w:rFonts w:ascii="Times New Roman" w:hAnsi="Times New Roman" w:eastAsia="Times New Roman"/>
+          <w:b w:val="0"/>
+          <w:i w:val="0"/>
+          <w:sz w:val="26"/>
+        </w:rPr>
+        <w:t xml:space="preserve">; Mã giao dịch đối chiếu (tương thích V2): </w:t>
       </w:r>
       <w:r>
         <w:rPr>
@@ -1246,67 +1731,15 @@
           <w:i w:val="0"/>
           <w:sz w:val="26"/>
         </w:rPr>
-        <w:t xml:space="preserve">; hoàn tất lúc: </w:t>
-      </w:r>
-      <w:r>
-        <w:rPr>
-          <w:rFonts w:ascii="Times New Roman" w:hAnsi="Times New Roman" w:eastAsia="Times New Roman"/>
-          <w:b w:val="0"/>
-          <w:i w:val="0"/>
-          <w:sz w:val="26"/>
-        </w:rPr>
-        <w:t>{{payment.initial.paidAt}}</w:t>
-      </w:r>
-      <w:r>
-        <w:rPr>
-          <w:rFonts w:ascii="Times New Roman" w:hAnsi="Times New Roman" w:eastAsia="Times New Roman"/>
-          <w:b w:val="0"/>
-          <w:i w:val="0"/>
-          <w:sz w:val="26"/>
-        </w:rPr>
-        <w:t xml:space="preserve">; trạng thái: </w:t>
-      </w:r>
-      <w:r>
-        <w:rPr>
-          <w:rFonts w:ascii="Times New Roman" w:hAnsi="Times New Roman" w:eastAsia="Times New Roman"/>
-          <w:b w:val="0"/>
-          <w:i w:val="0"/>
-          <w:sz w:val="26"/>
-        </w:rPr>
-        <w:t>{{payment.initial.status}}</w:t>
-      </w:r>
-      <w:r>
-        <w:rPr>
-          <w:rFonts w:ascii="Times New Roman" w:hAnsi="Times New Roman" w:eastAsia="Times New Roman"/>
-          <w:b w:val="0"/>
-          <w:i w:val="0"/>
-          <w:sz w:val="26"/>
-        </w:rPr>
-        <w:t xml:space="preserve">; tổng tiền ban đầu: </w:t>
-      </w:r>
-      <w:r>
-        <w:rPr>
-          <w:rFonts w:ascii="Times New Roman" w:hAnsi="Times New Roman" w:eastAsia="Times New Roman"/>
-          <w:b w:val="0"/>
-          <w:i w:val="0"/>
-          <w:sz w:val="26"/>
-        </w:rPr>
-        <w:t>{{payment.initial.totalAmount}}</w:t>
-      </w:r>
-      <w:r>
-        <w:rPr>
-          <w:rFonts w:ascii="Times New Roman" w:hAnsi="Times New Roman" w:eastAsia="Times New Roman"/>
-          <w:b w:val="0"/>
-          <w:i w:val="0"/>
-          <w:sz w:val="26"/>
-        </w:rPr>
         <w:t>.</w:t>
       </w:r>
     </w:p>
     <w:p>
       <w:pPr>
         <w:keepNext/>
-        <w:spacing w:before="100" w:after="60"/>
+        <w:spacing w:before="100" w:after="60" w:line="269" w:lineRule="auto"/>
+        <w:ind w:left="0"/>
+        <w:jc w:val="left"/>
       </w:pPr>
       <w:r>
         <w:rPr>
@@ -1320,7 +1753,10 @@
     </w:p>
     <w:p>
       <w:pPr>
-        <w:spacing w:after="20"/>
+        <w:keepNext/>
+        <w:spacing w:before="0" w:after="20" w:line="269" w:lineRule="auto"/>
+        <w:ind w:left="0"/>
+        <w:jc w:val="both"/>
       </w:pPr>
       <w:r>
         <w:rPr>
@@ -1334,7 +1770,9 @@
     </w:p>
     <w:p>
       <w:pPr>
-        <w:spacing w:after="60"/>
+        <w:keepNext w:val="0"/>
+        <w:spacing w:before="0" w:after="60" w:line="269" w:lineRule="auto"/>
+        <w:ind w:left="0"/>
         <w:jc w:val="center"/>
       </w:pPr>
       <w:r>
@@ -1349,7 +1787,10 @@
     </w:p>
     <w:p>
       <w:pPr>
-        <w:spacing w:after="20"/>
+        <w:keepNext/>
+        <w:spacing w:before="0" w:after="20" w:line="269" w:lineRule="auto"/>
+        <w:ind w:left="0"/>
+        <w:jc w:val="both"/>
       </w:pPr>
       <w:r>
         <w:rPr>
@@ -1363,7 +1804,9 @@
     </w:p>
     <w:p>
       <w:pPr>
-        <w:spacing w:after="60"/>
+        <w:keepNext w:val="0"/>
+        <w:spacing w:before="0" w:after="60" w:line="269" w:lineRule="auto"/>
+        <w:ind w:left="0"/>
         <w:jc w:val="center"/>
       </w:pPr>
       <w:r>
@@ -1378,7 +1821,8 @@
     </w:p>
     <w:p>
       <w:pPr>
-        <w:spacing w:after="40" w:line="276" w:lineRule="auto"/>
+        <w:keepNext w:val="0"/>
+        <w:spacing w:before="0" w:after="40" w:line="269" w:lineRule="auto"/>
         <w:ind w:left="0"/>
         <w:jc w:val="both"/>
       </w:pPr>
@@ -1389,13 +1833,15 @@
           <w:i w:val="0"/>
           <w:sz w:val="26"/>
         </w:rPr>
-        <w:t>4.3. Đối với tiện ích dùng chung (nếu có), Bên B được quyền sử dụng theo nội quy, khung giờ và tình trạng vận hành của đơn vị quản lý, không cấu thành cam kết vận hành liên tục tuyệt đối.</w:t>
+        <w:t>4.3. Đối với tiện ích dùng chung (nếu có), Bên B được quyền sử dụng các tiện ích chung theo nội quy, khung giờ và tình trạng vận hành của đơn vị quản lý.</w:t>
       </w:r>
     </w:p>
     <w:p>
       <w:pPr>
         <w:keepNext/>
-        <w:spacing w:before="100" w:after="60"/>
+        <w:spacing w:before="100" w:after="60" w:line="269" w:lineRule="auto"/>
+        <w:ind w:left="0"/>
+        <w:jc w:val="left"/>
       </w:pPr>
       <w:r>
         <w:rPr>
@@ -1409,7 +1855,10 @@
     </w:p>
     <w:p>
       <w:pPr>
-        <w:spacing w:after="20"/>
+        <w:keepNext/>
+        <w:spacing w:before="0" w:after="20" w:line="269" w:lineRule="auto"/>
+        <w:ind w:left="0"/>
+        <w:jc w:val="both"/>
       </w:pPr>
       <w:r>
         <w:rPr>
@@ -1423,7 +1872,9 @@
     </w:p>
     <w:p>
       <w:pPr>
-        <w:spacing w:after="60"/>
+        <w:keepNext w:val="0"/>
+        <w:spacing w:before="0" w:after="60" w:line="269" w:lineRule="auto"/>
+        <w:ind w:left="0"/>
         <w:jc w:val="center"/>
       </w:pPr>
       <w:r>
@@ -1438,7 +1889,8 @@
     </w:p>
     <w:p>
       <w:pPr>
-        <w:spacing w:after="40" w:line="276" w:lineRule="auto"/>
+        <w:keepNext w:val="0"/>
+        <w:spacing w:before="0" w:after="40" w:line="269" w:lineRule="auto"/>
         <w:ind w:left="0"/>
         <w:jc w:val="both"/>
       </w:pPr>
@@ -1455,7 +1907,9 @@
     <w:p>
       <w:pPr>
         <w:keepNext/>
-        <w:spacing w:before="100" w:after="60"/>
+        <w:spacing w:before="100" w:after="60" w:line="269" w:lineRule="auto"/>
+        <w:ind w:left="0"/>
+        <w:jc w:val="left"/>
       </w:pPr>
       <w:r>
         <w:rPr>
@@ -1469,7 +1923,8 @@
     </w:p>
     <w:p>
       <w:pPr>
-        <w:spacing w:after="40" w:line="276" w:lineRule="auto"/>
+        <w:keepNext w:val="0"/>
+        <w:spacing w:before="0" w:after="40" w:line="269" w:lineRule="auto"/>
         <w:ind w:left="0"/>
         <w:jc w:val="both"/>
       </w:pPr>
@@ -1485,7 +1940,8 @@
     </w:p>
     <w:p>
       <w:pPr>
-        <w:spacing w:after="40" w:line="276" w:lineRule="auto"/>
+        <w:keepNext w:val="0"/>
+        <w:spacing w:before="0" w:after="40" w:line="269" w:lineRule="auto"/>
         <w:ind w:left="0"/>
         <w:jc w:val="both"/>
       </w:pPr>
@@ -1496,12 +1952,13 @@
           <w:i w:val="0"/>
           <w:sz w:val="26"/>
         </w:rPr>
-        <w:t>6.2. Hướng dẫn, phối hợp thủ tục đăng ký tạm trú theo Luật Cư trú và bảo trì kết cấu căn nhà theo thỏa thuận.</w:t>
+        <w:t>6.2. Cung cấp tài khoản ngân hàng chính xác để nhận thanh toán; kiểm tra và xác nhận kịp thời khi nhận được tiền.</w:t>
       </w:r>
     </w:p>
     <w:p>
       <w:pPr>
-        <w:spacing w:after="40" w:line="276" w:lineRule="auto"/>
+        <w:keepNext w:val="0"/>
+        <w:spacing w:before="0" w:after="40" w:line="269" w:lineRule="auto"/>
         <w:ind w:left="0"/>
         <w:jc w:val="both"/>
       </w:pPr>
@@ -1512,13 +1969,15 @@
           <w:i w:val="0"/>
           <w:sz w:val="26"/>
         </w:rPr>
-        <w:t>6.3. Không cản trở trái pháp luật việc Bên B sử dụng tài sản thuê đúng mục đích trong thời hạn hợp đồng.</w:t>
+        <w:t>6.3. Hướng dẫn thủ tục đăng ký tạm trú theo Luật Cư trú; bảo trì kết cấu căn nhà theo thỏa thuận.</w:t>
       </w:r>
     </w:p>
     <w:p>
       <w:pPr>
         <w:keepNext/>
-        <w:spacing w:before="100" w:after="60"/>
+        <w:spacing w:before="100" w:after="60" w:line="269" w:lineRule="auto"/>
+        <w:ind w:left="0"/>
+        <w:jc w:val="left"/>
       </w:pPr>
       <w:r>
         <w:rPr>
@@ -1533,7 +1992,9 @@
     <w:p>
       <w:pPr>
         <w:keepNext w:val="0"/>
-        <w:spacing w:before="0" w:after="40" w:line="276" w:lineRule="auto"/>
+        <w:spacing w:before="0" w:after="40" w:line="269" w:lineRule="auto"/>
+        <w:ind w:left="0"/>
+        <w:jc w:val="both"/>
       </w:pPr>
       <w:r>
         <w:rPr>
@@ -1601,7 +2062,8 @@
     </w:p>
     <w:p>
       <w:pPr>
-        <w:spacing w:after="40" w:line="276" w:lineRule="auto"/>
+        <w:keepNext w:val="0"/>
+        <w:spacing w:before="0" w:after="40" w:line="269" w:lineRule="auto"/>
         <w:ind w:left="0"/>
         <w:jc w:val="both"/>
       </w:pPr>
@@ -1612,12 +2074,13 @@
           <w:i w:val="0"/>
           <w:sz w:val="26"/>
         </w:rPr>
-        <w:t>7.2. Chấp hành tuyệt đối các quy định an toàn PCCC, an ninh trật tự địa phương và quy định cư trú.</w:t>
+        <w:t>7.2. Chấp hành tuyệt đối các quy định an toàn PCCC, an ninh trật tự địa phương.</w:t>
       </w:r>
     </w:p>
     <w:p>
       <w:pPr>
-        <w:spacing w:after="40" w:line="276" w:lineRule="auto"/>
+        <w:keepNext w:val="0"/>
+        <w:spacing w:before="0" w:after="40" w:line="269" w:lineRule="auto"/>
         <w:ind w:left="0"/>
         <w:jc w:val="both"/>
       </w:pPr>
@@ -1628,29 +2091,15 @@
           <w:i w:val="0"/>
           <w:sz w:val="26"/>
         </w:rPr>
-        <w:t>7.3. Thanh toán tiền thuê và chi phí đầy đủ, đúng hạn qua nền tảng HomeSpace.</w:t>
-      </w:r>
-    </w:p>
-    <w:p>
-      <w:pPr>
-        <w:spacing w:after="40" w:line="276" w:lineRule="auto"/>
-        <w:ind w:left="0"/>
-        <w:jc w:val="both"/>
-      </w:pPr>
-      <w:r>
-        <w:rPr>
-          <w:rFonts w:ascii="Times New Roman" w:hAnsi="Times New Roman" w:eastAsia="Times New Roman"/>
-          <w:b w:val="0"/>
-          <w:i w:val="0"/>
-          <w:sz w:val="26"/>
-        </w:rPr>
-        <w:t>7.4. Chịu trách nhiệm đối với hư hỏng do lỗi của mình, người cùng cư trú, khách hoặc người do mình quản lý gây ra; hoàn trả nhà theo hiện trạng bàn giao, trừ hao mòn tự nhiên.</w:t>
+        <w:t>7.3. Chuyển khoản tiền thuê và chi phí đầy đủ, đúng hạn vào tài khoản ngân hàng của Bên A.</w:t>
       </w:r>
     </w:p>
     <w:p>
       <w:pPr>
         <w:keepNext/>
-        <w:spacing w:before="100" w:after="60"/>
+        <w:spacing w:before="100" w:after="60" w:line="269" w:lineRule="auto"/>
+        <w:ind w:left="0"/>
+        <w:jc w:val="left"/>
       </w:pPr>
       <w:r>
         <w:rPr>
@@ -1659,12 +2108,13 @@
           <w:i w:val="0"/>
           <w:sz w:val="26"/>
         </w:rPr>
-        <w:t>ĐIỀU 8. ĐIỀU KHOẢN ĐẶC THÙ VỀ THÚ CƯNG VÀ NỘI QUY</w:t>
+        <w:t>ĐIỀU 8. ĐIỀU KHOẢN VỀ VẬT NUÔI VÀ THỎA THUẬN KHÁC</w:t>
       </w:r>
     </w:p>
     <w:p>
       <w:pPr>
-        <w:spacing w:after="40" w:line="276" w:lineRule="auto"/>
+        <w:keepNext w:val="0"/>
+        <w:spacing w:before="0" w:after="40" w:line="269" w:lineRule="auto"/>
         <w:ind w:left="0"/>
         <w:jc w:val="both"/>
       </w:pPr>
@@ -1681,7 +2131,9 @@
     <w:p>
       <w:pPr>
         <w:keepNext w:val="0"/>
-        <w:spacing w:before="0" w:after="40" w:line="276" w:lineRule="auto"/>
+        <w:spacing w:before="0" w:after="40" w:line="269" w:lineRule="auto"/>
+        <w:ind w:left="0"/>
+        <w:jc w:val="both"/>
       </w:pPr>
       <w:r>
         <w:rPr>
@@ -1690,7 +2142,7 @@
           <w:i w:val="0"/>
           <w:sz w:val="26"/>
         </w:rPr>
-        <w:t xml:space="preserve">8.2. Điều khoản đặc biệt khác: </w:t>
+        <w:t xml:space="preserve">8.2. Thỏa thuận bổ sung: </w:t>
       </w:r>
       <w:r>
         <w:rPr>
@@ -1714,7 +2166,9 @@
     <w:p>
       <w:pPr>
         <w:keepNext/>
-        <w:spacing w:before="100" w:after="60"/>
+        <w:spacing w:before="100" w:after="60" w:line="269" w:lineRule="auto"/>
+        <w:ind w:left="0"/>
+        <w:jc w:val="left"/>
       </w:pPr>
       <w:r>
         <w:rPr>
@@ -1728,7 +2182,8 @@
     </w:p>
     <w:p>
       <w:pPr>
-        <w:spacing w:after="40" w:line="276" w:lineRule="auto"/>
+        <w:keepNext w:val="0"/>
+        <w:spacing w:before="0" w:after="40" w:line="269" w:lineRule="auto"/>
         <w:ind w:left="0"/>
         <w:jc w:val="both"/>
       </w:pPr>
@@ -1739,12 +2194,13 @@
           <w:i w:val="0"/>
           <w:sz w:val="26"/>
         </w:rPr>
-        <w:t>9.1. Việc chấm dứt hợp đồng, thông báo trước, hoàn trả nhà và xử lý tiền cọc thực hiện theo thỏa thuận hợp pháp của các bên và pháp luật áp dụng; hiện trạng hoàn trả được xác định có tính đến hao mòn tự nhiên.</w:t>
+        <w:t>9.1. Việc chấm dứt hợp đồng, thông báo trước, hoàn trả nhà và quyết toán hoàn cọc chuyển khoản trực tiếp thực hiện theo thỏa thuận của các bên và pháp luật áp dụng.</w:t>
       </w:r>
     </w:p>
     <w:p>
       <w:pPr>
-        <w:spacing w:after="40" w:line="276" w:lineRule="auto"/>
+        <w:keepNext w:val="0"/>
+        <w:spacing w:before="0" w:after="40" w:line="269" w:lineRule="auto"/>
         <w:ind w:left="0"/>
         <w:jc w:val="both"/>
       </w:pPr>
@@ -1755,13 +2211,15 @@
           <w:i w:val="0"/>
           <w:sz w:val="26"/>
         </w:rPr>
-        <w:t>9.2. Trường hợp bất khả kháng được xử lý theo pháp luật và thỏa thuận; tranh chấp trước hết được thương lượng, nếu không thành thì giải quyết tại Tòa án có thẩm quyền.</w:t>
+        <w:t>9.2. Tranh chấp trước hết được giải quyết thông qua thương lượng; nếu không thành, các bên có quyền yêu cầu Tòa án có thẩm quyền giải quyết theo pháp luật.</w:t>
       </w:r>
     </w:p>
     <w:p>
       <w:pPr>
         <w:keepNext/>
-        <w:spacing w:before="100" w:after="60"/>
+        <w:spacing w:before="100" w:after="60" w:line="269" w:lineRule="auto"/>
+        <w:ind w:left="0"/>
+        <w:jc w:val="left"/>
       </w:pPr>
       <w:r>
         <w:rPr>
@@ -1775,7 +2233,8 @@
     </w:p>
     <w:p>
       <w:pPr>
-        <w:spacing w:after="40" w:line="276" w:lineRule="auto"/>
+        <w:keepNext w:val="0"/>
+        <w:spacing w:before="0" w:after="40" w:line="269" w:lineRule="auto"/>
         <w:ind w:left="0"/>
         <w:jc w:val="both"/>
       </w:pPr>
@@ -1792,7 +2251,9 @@
     <w:p>
       <w:pPr>
         <w:keepNext w:val="0"/>
-        <w:spacing w:before="0" w:after="40" w:line="276" w:lineRule="auto"/>
+        <w:spacing w:before="0" w:after="40" w:line="269" w:lineRule="auto"/>
+        <w:ind w:left="0"/>
+        <w:jc w:val="both"/>
       </w:pPr>
       <w:r>
         <w:rPr>
@@ -1842,7 +2303,8 @@
     </w:p>
     <w:p>
       <w:pPr>
-        <w:spacing w:after="40" w:line="276" w:lineRule="auto"/>
+        <w:keepNext w:val="0"/>
+        <w:spacing w:before="0" w:after="40" w:line="269" w:lineRule="auto"/>
         <w:ind w:left="0"/>
         <w:jc w:val="both"/>
       </w:pPr>
@@ -1858,7 +2320,9 @@
     </w:p>
     <w:p>
       <w:pPr>
-        <w:pageBreakBefore/>
+        <w:keepNext/>
+        <w:spacing w:before="140" w:after="80" w:line="269" w:lineRule="auto"/>
+        <w:ind w:left="0"/>
         <w:jc w:val="center"/>
       </w:pPr>
       <w:r>
@@ -1899,7 +2363,7 @@
                 <w:i w:val="0"/>
                 <w:sz w:val="26"/>
               </w:rPr>
-              <w:t>BÊN CHO THUÊ (BÊN A)</w:t>
+              <w:t>ĐẠI DIỆN BÊN A</w:t>
             </w:r>
           </w:p>
         </w:tc>
@@ -1919,7 +2383,7 @@
                 <w:i w:val="0"/>
                 <w:sz w:val="26"/>
               </w:rPr>
-              <w:t>BÊN THUÊ (BÊN B)</w:t>
+              <w:t>ĐẠI DIỆN BÊN B</w:t>
             </w:r>
           </w:p>
         </w:tc>
@@ -1994,7 +2458,9 @@
     </w:pPr>
     <w:r>
       <w:rPr>
-        <w:rFonts w:ascii="Times New Roman" w:hAnsi="Times New Roman"/>
+        <w:rFonts w:ascii="Times New Roman" w:hAnsi="Times New Roman" w:eastAsia="Times New Roman"/>
+        <w:b w:val="0"/>
+        <w:i w:val="0"/>
         <w:sz w:val="18"/>
       </w:rPr>
       <w:t xml:space="preserve">Trang </w:t>

</xml_diff>